<commit_message>
Aplica identidade visual Enaex ao modelo do relatório sismográfico
- Título em vermelho Enaex, subtítulos em cinza e fios finos no modelo publicado
- Sanitizador aplica o estilo visual definido em config.json (visual_style)
- Modelo público regenerado a partir do DOCX autoritativo (hash reproduzido)

Co-Authored-By: Claude Haiku 5.5 <noreply@anthropic.com>
</commit_message>
<xml_diff>
--- a/pages/assets/template.docx
+++ b/pages/assets/template.docx
@@ -160,6 +160,7 @@
       <w:r>
         <w:rPr>
           <w:b/>
+          <w:color w:val="B5121B"/>
           <w:sz w:val="28"/>
           <w:szCs w:val="28"/>
         </w:rPr>
@@ -168,6 +169,7 @@
       <w:r>
         <w:rPr>
           <w:b/>
+          <w:color w:val="B5121B"/>
           <w:sz w:val="28"/>
           <w:szCs w:val="28"/>
         </w:rPr>
@@ -196,6 +198,7 @@
       <w:r>
         <w:rPr>
           <w:b/>
+          <w:color w:val="4A4F55"/>
           <w:sz w:val="28"/>
           <w:szCs w:val="28"/>
         </w:rPr>
@@ -204,6 +207,7 @@
       <w:r>
         <w:rPr>
           <w:b/>
+          <w:color w:val="4A4F55"/>
           <w:sz w:val="28"/>
           <w:szCs w:val="28"/>
         </w:rPr>
@@ -222,6 +226,7 @@
       <w:r>
         <w:rPr>
           <w:b/>
+          <w:color w:val="4A4F55"/>
           <w:sz w:val="28"/>
           <w:szCs w:val="28"/>
         </w:rPr>
@@ -230,6 +235,7 @@
       <w:r>
         <w:rPr>
           <w:b/>
+          <w:color w:val="4A4F55"/>
           <w:sz w:val="28"/>
           <w:szCs w:val="28"/>
         </w:rPr>
@@ -238,6 +244,7 @@
       <w:r>
         <w:rPr>
           <w:b/>
+          <w:color w:val="4A4F55"/>
           <w:sz w:val="28"/>
           <w:szCs w:val="28"/>
         </w:rPr>
@@ -839,10 +846,10 @@
           <w:tcPr>
             <w:tcW w:w="1520" w:type="pct"/>
             <w:tcBorders>
-              <w:top w:val="single" w:sz="4" w:space="0" w:color="auto"/>
-              <w:left w:val="single" w:sz="4" w:space="0" w:color="auto"/>
-              <w:bottom w:val="single" w:sz="4" w:space="0" w:color="auto"/>
-              <w:right w:val="single" w:sz="4" w:space="0" w:color="auto"/>
+              <w:top w:val="single" w:sz="4" w:space="0" w:color="E3E3E3"/>
+              <w:left w:val="nil"/>
+              <w:bottom w:val="single" w:sz="4" w:space="0" w:color="E3E3E3"/>
+              <w:right w:val="nil"/>
             </w:tcBorders>
             <w:shd w:val="clear" w:color="000000" w:fill="F2F2F2"/>
             <w:noWrap/>
@@ -879,10 +886,10 @@
           <w:tcPr>
             <w:tcW w:w="3480" w:type="pct"/>
             <w:tcBorders>
-              <w:top w:val="single" w:sz="4" w:space="0" w:color="auto"/>
+              <w:top w:val="single" w:sz="4" w:space="0" w:color="E3E3E3"/>
               <w:left w:val="nil"/>
-              <w:bottom w:val="single" w:sz="4" w:space="0" w:color="auto"/>
-              <w:right w:val="single" w:sz="4" w:space="0" w:color="auto"/>
+              <w:bottom w:val="single" w:sz="4" w:space="0" w:color="E3E3E3"/>
+              <w:right w:val="nil"/>
             </w:tcBorders>
             <w:noWrap/>
             <w:vAlign w:val="center"/>
@@ -919,10 +926,10 @@
           <w:tcPr>
             <w:tcW w:w="1520" w:type="pct"/>
             <w:tcBorders>
-              <w:top w:val="single" w:sz="4" w:space="0" w:color="auto"/>
-              <w:left w:val="single" w:sz="4" w:space="0" w:color="auto"/>
-              <w:bottom w:val="single" w:sz="4" w:space="0" w:color="auto"/>
-              <w:right w:val="single" w:sz="4" w:space="0" w:color="auto"/>
+              <w:top w:val="single" w:sz="4" w:space="0" w:color="E3E3E3"/>
+              <w:left w:val="nil"/>
+              <w:bottom w:val="single" w:sz="4" w:space="0" w:color="E3E3E3"/>
+              <w:right w:val="nil"/>
             </w:tcBorders>
             <w:shd w:val="clear" w:color="000000" w:fill="F2F2F2"/>
             <w:noWrap/>
@@ -959,10 +966,10 @@
           <w:tcPr>
             <w:tcW w:w="3480" w:type="pct"/>
             <w:tcBorders>
-              <w:top w:val="single" w:sz="4" w:space="0" w:color="auto"/>
+              <w:top w:val="single" w:sz="4" w:space="0" w:color="E3E3E3"/>
               <w:left w:val="nil"/>
-              <w:bottom w:val="single" w:sz="4" w:space="0" w:color="auto"/>
-              <w:right w:val="single" w:sz="4" w:space="0" w:color="auto"/>
+              <w:bottom w:val="single" w:sz="4" w:space="0" w:color="E3E3E3"/>
+              <w:right w:val="nil"/>
             </w:tcBorders>
             <w:vAlign w:val="center"/>
             <w:hideMark/>
@@ -4336,12 +4343,12 @@
       <w:tblPr>
         <w:tblW w:w="5000" w:type="pct"/>
         <w:tblBorders>
-          <w:top w:val="single" w:sz="4" w:space="0" w:color="auto"/>
-          <w:left w:val="single" w:sz="4" w:space="0" w:color="auto"/>
-          <w:bottom w:val="single" w:sz="4" w:space="0" w:color="auto"/>
-          <w:right w:val="single" w:sz="4" w:space="0" w:color="auto"/>
-          <w:insideH w:val="single" w:sz="4" w:space="0" w:color="auto"/>
-          <w:insideV w:val="single" w:sz="4" w:space="0" w:color="auto"/>
+          <w:top w:val="single" w:sz="4" w:space="0" w:color="E3E3E3"/>
+          <w:left w:val="nil"/>
+          <w:bottom w:val="single" w:sz="4" w:space="0" w:color="E3E3E3"/>
+          <w:right w:val="nil"/>
+          <w:insideH w:val="single" w:sz="4" w:space="0" w:color="E3E3E3"/>
+          <w:insideV w:val="nil"/>
         </w:tblBorders>
         <w:tblCellMar>
           <w:left w:w="70" w:type="dxa"/>
@@ -5409,10 +5416,10 @@
           <w:tcPr>
             <w:tcW w:w="914" w:type="pct"/>
             <w:tcBorders>
-              <w:top w:val="single" w:sz="4" w:space="0" w:color="auto"/>
-              <w:left w:val="single" w:sz="4" w:space="0" w:color="auto"/>
-              <w:bottom w:val="single" w:sz="4" w:space="0" w:color="auto"/>
-              <w:right w:val="single" w:sz="4" w:space="0" w:color="000000"/>
+              <w:top w:val="single" w:sz="4" w:space="0" w:color="E3E3E3"/>
+              <w:left w:val="nil"/>
+              <w:bottom w:val="single" w:sz="4" w:space="0" w:color="E3E3E3"/>
+              <w:right w:val="nil"/>
             </w:tcBorders>
             <w:shd w:val="clear" w:color="000000" w:fill="F2F2F2"/>
             <w:vAlign w:val="center"/>
@@ -5447,10 +5454,10 @@
           <w:tcPr>
             <w:tcW w:w="914" w:type="pct"/>
             <w:tcBorders>
-              <w:top w:val="single" w:sz="4" w:space="0" w:color="auto"/>
-              <w:left w:val="single" w:sz="4" w:space="0" w:color="auto"/>
-              <w:bottom w:val="single" w:sz="4" w:space="0" w:color="auto"/>
-              <w:right w:val="single" w:sz="4" w:space="0" w:color="000000"/>
+              <w:top w:val="single" w:sz="4" w:space="0" w:color="E3E3E3"/>
+              <w:left w:val="nil"/>
+              <w:bottom w:val="single" w:sz="4" w:space="0" w:color="E3E3E3"/>
+              <w:right w:val="nil"/>
             </w:tcBorders>
             <w:shd w:val="clear" w:color="000000" w:fill="F2F2F2"/>
             <w:noWrap/>
@@ -5487,10 +5494,10 @@
           <w:tcPr>
             <w:tcW w:w="882" w:type="pct"/>
             <w:tcBorders>
-              <w:top w:val="single" w:sz="4" w:space="0" w:color="auto"/>
+              <w:top w:val="single" w:sz="4" w:space="0" w:color="E3E3E3"/>
               <w:left w:val="nil"/>
-              <w:bottom w:val="single" w:sz="4" w:space="0" w:color="auto"/>
-              <w:right w:val="single" w:sz="4" w:space="0" w:color="auto"/>
+              <w:bottom w:val="single" w:sz="4" w:space="0" w:color="E3E3E3"/>
+              <w:right w:val="nil"/>
             </w:tcBorders>
             <w:shd w:val="clear" w:color="000000" w:fill="F2F2F2"/>
             <w:noWrap/>
@@ -5527,10 +5534,10 @@
           <w:tcPr>
             <w:tcW w:w="619" w:type="pct"/>
             <w:tcBorders>
-              <w:top w:val="single" w:sz="4" w:space="0" w:color="auto"/>
+              <w:top w:val="single" w:sz="4" w:space="0" w:color="E3E3E3"/>
               <w:left w:val="nil"/>
-              <w:bottom w:val="single" w:sz="4" w:space="0" w:color="auto"/>
-              <w:right w:val="single" w:sz="4" w:space="0" w:color="auto"/>
+              <w:bottom w:val="single" w:sz="4" w:space="0" w:color="E3E3E3"/>
+              <w:right w:val="nil"/>
             </w:tcBorders>
             <w:shd w:val="clear" w:color="000000" w:fill="F2F2F2"/>
             <w:noWrap/>
@@ -5567,10 +5574,10 @@
           <w:tcPr>
             <w:tcW w:w="1672" w:type="pct"/>
             <w:tcBorders>
-              <w:top w:val="single" w:sz="4" w:space="0" w:color="auto"/>
+              <w:top w:val="single" w:sz="4" w:space="0" w:color="E3E3E3"/>
               <w:left w:val="nil"/>
-              <w:bottom w:val="single" w:sz="4" w:space="0" w:color="auto"/>
-              <w:right w:val="single" w:sz="4" w:space="0" w:color="000000"/>
+              <w:bottom w:val="single" w:sz="4" w:space="0" w:color="E3E3E3"/>
+              <w:right w:val="nil"/>
             </w:tcBorders>
             <w:shd w:val="clear" w:color="000000" w:fill="F2F2F2"/>
             <w:noWrap/>
@@ -5612,10 +5619,10 @@
           <w:tcPr>
             <w:tcW w:w="914" w:type="pct"/>
             <w:tcBorders>
-              <w:top w:val="single" w:sz="4" w:space="0" w:color="auto"/>
-              <w:left w:val="single" w:sz="4" w:space="0" w:color="auto"/>
-              <w:bottom w:val="single" w:sz="4" w:space="0" w:color="auto"/>
-              <w:right w:val="single" w:sz="4" w:space="0" w:color="000000"/>
+              <w:top w:val="single" w:sz="4" w:space="0" w:color="E3E3E3"/>
+              <w:left w:val="nil"/>
+              <w:bottom w:val="single" w:sz="4" w:space="0" w:color="E3E3E3"/>
+              <w:right w:val="nil"/>
             </w:tcBorders>
             <w:vAlign w:val="center"/>
           </w:tcPr>
@@ -5645,10 +5652,10 @@
           <w:tcPr>
             <w:tcW w:w="914" w:type="pct"/>
             <w:tcBorders>
-              <w:top w:val="single" w:sz="4" w:space="0" w:color="auto"/>
-              <w:left w:val="single" w:sz="4" w:space="0" w:color="auto"/>
-              <w:bottom w:val="single" w:sz="4" w:space="0" w:color="auto"/>
-              <w:right w:val="single" w:sz="4" w:space="0" w:color="000000"/>
+              <w:top w:val="single" w:sz="4" w:space="0" w:color="E3E3E3"/>
+              <w:left w:val="nil"/>
+              <w:bottom w:val="single" w:sz="4" w:space="0" w:color="E3E3E3"/>
+              <w:right w:val="nil"/>
             </w:tcBorders>
             <w:noWrap/>
             <w:vAlign w:val="center"/>
@@ -5680,10 +5687,10 @@
           <w:tcPr>
             <w:tcW w:w="882" w:type="pct"/>
             <w:tcBorders>
-              <w:top w:val="single" w:sz="4" w:space="0" w:color="auto"/>
+              <w:top w:val="single" w:sz="4" w:space="0" w:color="E3E3E3"/>
               <w:left w:val="nil"/>
-              <w:bottom w:val="single" w:sz="4" w:space="0" w:color="auto"/>
-              <w:right w:val="single" w:sz="4" w:space="0" w:color="auto"/>
+              <w:bottom w:val="single" w:sz="4" w:space="0" w:color="E3E3E3"/>
+              <w:right w:val="nil"/>
             </w:tcBorders>
             <w:noWrap/>
             <w:vAlign w:val="center"/>
@@ -5715,10 +5722,10 @@
           <w:tcPr>
             <w:tcW w:w="619" w:type="pct"/>
             <w:tcBorders>
-              <w:top w:val="single" w:sz="4" w:space="0" w:color="auto"/>
+              <w:top w:val="single" w:sz="4" w:space="0" w:color="E3E3E3"/>
               <w:left w:val="nil"/>
-              <w:bottom w:val="single" w:sz="4" w:space="0" w:color="auto"/>
-              <w:right w:val="single" w:sz="4" w:space="0" w:color="auto"/>
+              <w:bottom w:val="single" w:sz="4" w:space="0" w:color="E3E3E3"/>
+              <w:right w:val="nil"/>
             </w:tcBorders>
             <w:noWrap/>
             <w:vAlign w:val="center"/>
@@ -5740,10 +5747,10 @@
           <w:tcPr>
             <w:tcW w:w="1672" w:type="pct"/>
             <w:tcBorders>
-              <w:top w:val="single" w:sz="4" w:space="0" w:color="auto"/>
+              <w:top w:val="single" w:sz="4" w:space="0" w:color="E3E3E3"/>
               <w:left w:val="nil"/>
-              <w:bottom w:val="single" w:sz="4" w:space="0" w:color="auto"/>
-              <w:right w:val="single" w:sz="4" w:space="0" w:color="000000"/>
+              <w:bottom w:val="single" w:sz="4" w:space="0" w:color="E3E3E3"/>
+              <w:right w:val="nil"/>
             </w:tcBorders>
             <w:noWrap/>
             <w:vAlign w:val="center"/>
@@ -5770,10 +5777,10 @@
           <w:tcPr>
             <w:tcW w:w="914" w:type="pct"/>
             <w:tcBorders>
-              <w:top w:val="single" w:sz="4" w:space="0" w:color="auto"/>
-              <w:left w:val="single" w:sz="4" w:space="0" w:color="auto"/>
-              <w:bottom w:val="single" w:sz="4" w:space="0" w:color="auto"/>
-              <w:right w:val="single" w:sz="4" w:space="0" w:color="000000"/>
+              <w:top w:val="single" w:sz="4" w:space="0" w:color="E3E3E3"/>
+              <w:left w:val="nil"/>
+              <w:bottom w:val="single" w:sz="4" w:space="0" w:color="E3E3E3"/>
+              <w:right w:val="nil"/>
             </w:tcBorders>
             <w:vAlign w:val="center"/>
           </w:tcPr>
@@ -5803,10 +5810,10 @@
           <w:tcPr>
             <w:tcW w:w="914" w:type="pct"/>
             <w:tcBorders>
-              <w:top w:val="single" w:sz="4" w:space="0" w:color="auto"/>
-              <w:left w:val="single" w:sz="4" w:space="0" w:color="auto"/>
-              <w:bottom w:val="single" w:sz="4" w:space="0" w:color="auto"/>
-              <w:right w:val="single" w:sz="4" w:space="0" w:color="000000"/>
+              <w:top w:val="single" w:sz="4" w:space="0" w:color="E3E3E3"/>
+              <w:left w:val="nil"/>
+              <w:bottom w:val="single" w:sz="4" w:space="0" w:color="E3E3E3"/>
+              <w:right w:val="nil"/>
             </w:tcBorders>
             <w:noWrap/>
             <w:vAlign w:val="center"/>
@@ -5837,10 +5844,10 @@
           <w:tcPr>
             <w:tcW w:w="882" w:type="pct"/>
             <w:tcBorders>
-              <w:top w:val="single" w:sz="4" w:space="0" w:color="auto"/>
+              <w:top w:val="single" w:sz="4" w:space="0" w:color="E3E3E3"/>
               <w:left w:val="nil"/>
-              <w:bottom w:val="single" w:sz="4" w:space="0" w:color="auto"/>
-              <w:right w:val="single" w:sz="4" w:space="0" w:color="auto"/>
+              <w:bottom w:val="single" w:sz="4" w:space="0" w:color="E3E3E3"/>
+              <w:right w:val="nil"/>
             </w:tcBorders>
             <w:noWrap/>
             <w:vAlign w:val="center"/>
@@ -5871,10 +5878,10 @@
           <w:tcPr>
             <w:tcW w:w="619" w:type="pct"/>
             <w:tcBorders>
-              <w:top w:val="single" w:sz="4" w:space="0" w:color="auto"/>
+              <w:top w:val="single" w:sz="4" w:space="0" w:color="E3E3E3"/>
               <w:left w:val="nil"/>
-              <w:bottom w:val="single" w:sz="4" w:space="0" w:color="auto"/>
-              <w:right w:val="single" w:sz="4" w:space="0" w:color="auto"/>
+              <w:bottom w:val="single" w:sz="4" w:space="0" w:color="E3E3E3"/>
+              <w:right w:val="nil"/>
             </w:tcBorders>
             <w:noWrap/>
             <w:vAlign w:val="center"/>
@@ -5896,10 +5903,10 @@
           <w:tcPr>
             <w:tcW w:w="1672" w:type="pct"/>
             <w:tcBorders>
-              <w:top w:val="single" w:sz="4" w:space="0" w:color="auto"/>
+              <w:top w:val="single" w:sz="4" w:space="0" w:color="E3E3E3"/>
               <w:left w:val="nil"/>
-              <w:bottom w:val="single" w:sz="4" w:space="0" w:color="auto"/>
-              <w:right w:val="single" w:sz="4" w:space="0" w:color="000000"/>
+              <w:bottom w:val="single" w:sz="4" w:space="0" w:color="E3E3E3"/>
+              <w:right w:val="nil"/>
             </w:tcBorders>
             <w:noWrap/>
             <w:vAlign w:val="center"/>
@@ -5926,10 +5933,10 @@
           <w:tcPr>
             <w:tcW w:w="914" w:type="pct"/>
             <w:tcBorders>
-              <w:top w:val="single" w:sz="4" w:space="0" w:color="auto"/>
-              <w:left w:val="single" w:sz="4" w:space="0" w:color="auto"/>
-              <w:bottom w:val="single" w:sz="4" w:space="0" w:color="auto"/>
-              <w:right w:val="single" w:sz="4" w:space="0" w:color="000000"/>
+              <w:top w:val="single" w:sz="4" w:space="0" w:color="E3E3E3"/>
+              <w:left w:val="nil"/>
+              <w:bottom w:val="single" w:sz="4" w:space="0" w:color="E3E3E3"/>
+              <w:right w:val="nil"/>
             </w:tcBorders>
             <w:vAlign w:val="center"/>
           </w:tcPr>
@@ -5959,10 +5966,10 @@
           <w:tcPr>
             <w:tcW w:w="914" w:type="pct"/>
             <w:tcBorders>
-              <w:top w:val="single" w:sz="4" w:space="0" w:color="auto"/>
-              <w:left w:val="single" w:sz="4" w:space="0" w:color="auto"/>
-              <w:bottom w:val="single" w:sz="4" w:space="0" w:color="auto"/>
-              <w:right w:val="single" w:sz="4" w:space="0" w:color="000000"/>
+              <w:top w:val="single" w:sz="4" w:space="0" w:color="E3E3E3"/>
+              <w:left w:val="nil"/>
+              <w:bottom w:val="single" w:sz="4" w:space="0" w:color="E3E3E3"/>
+              <w:right w:val="nil"/>
             </w:tcBorders>
             <w:noWrap/>
             <w:vAlign w:val="center"/>
@@ -5993,10 +6000,10 @@
           <w:tcPr>
             <w:tcW w:w="882" w:type="pct"/>
             <w:tcBorders>
-              <w:top w:val="single" w:sz="4" w:space="0" w:color="auto"/>
+              <w:top w:val="single" w:sz="4" w:space="0" w:color="E3E3E3"/>
               <w:left w:val="nil"/>
-              <w:bottom w:val="single" w:sz="4" w:space="0" w:color="auto"/>
-              <w:right w:val="single" w:sz="4" w:space="0" w:color="auto"/>
+              <w:bottom w:val="single" w:sz="4" w:space="0" w:color="E3E3E3"/>
+              <w:right w:val="nil"/>
             </w:tcBorders>
             <w:noWrap/>
             <w:vAlign w:val="center"/>
@@ -6027,10 +6034,10 @@
           <w:tcPr>
             <w:tcW w:w="619" w:type="pct"/>
             <w:tcBorders>
-              <w:top w:val="single" w:sz="4" w:space="0" w:color="auto"/>
+              <w:top w:val="single" w:sz="4" w:space="0" w:color="E3E3E3"/>
               <w:left w:val="nil"/>
-              <w:bottom w:val="single" w:sz="4" w:space="0" w:color="auto"/>
-              <w:right w:val="single" w:sz="4" w:space="0" w:color="auto"/>
+              <w:bottom w:val="single" w:sz="4" w:space="0" w:color="E3E3E3"/>
+              <w:right w:val="nil"/>
             </w:tcBorders>
             <w:noWrap/>
             <w:vAlign w:val="center"/>
@@ -6052,10 +6059,10 @@
           <w:tcPr>
             <w:tcW w:w="1672" w:type="pct"/>
             <w:tcBorders>
-              <w:top w:val="single" w:sz="4" w:space="0" w:color="auto"/>
+              <w:top w:val="single" w:sz="4" w:space="0" w:color="E3E3E3"/>
               <w:left w:val="nil"/>
-              <w:bottom w:val="single" w:sz="4" w:space="0" w:color="auto"/>
-              <w:right w:val="single" w:sz="4" w:space="0" w:color="000000"/>
+              <w:bottom w:val="single" w:sz="4" w:space="0" w:color="E3E3E3"/>
+              <w:right w:val="nil"/>
             </w:tcBorders>
             <w:noWrap/>
             <w:vAlign w:val="center"/>
@@ -7325,10 +7332,10 @@
             <w:tcW w:w="1037" w:type="pct"/>
             <w:vMerge w:val="restart"/>
             <w:tcBorders>
-              <w:top w:val="single" w:sz="4" w:space="0" w:color="auto"/>
-              <w:left w:val="single" w:sz="4" w:space="0" w:color="auto"/>
-              <w:bottom w:val="single" w:sz="4" w:space="0" w:color="auto"/>
-              <w:right w:val="single" w:sz="4" w:space="0" w:color="auto"/>
+              <w:top w:val="single" w:sz="4" w:space="0" w:color="E3E3E3"/>
+              <w:left w:val="nil"/>
+              <w:bottom w:val="single" w:sz="4" w:space="0" w:color="E3E3E3"/>
+              <w:right w:val="nil"/>
             </w:tcBorders>
             <w:shd w:val="clear" w:color="000000" w:fill="F2F2F2"/>
             <w:noWrap/>
@@ -7366,10 +7373,10 @@
             <w:tcW w:w="3332" w:type="pct"/>
             <w:gridSpan w:val="7"/>
             <w:tcBorders>
-              <w:top w:val="single" w:sz="4" w:space="0" w:color="auto"/>
+              <w:top w:val="single" w:sz="4" w:space="0" w:color="E3E3E3"/>
               <w:left w:val="nil"/>
-              <w:bottom w:val="single" w:sz="4" w:space="0" w:color="auto"/>
-              <w:right w:val="single" w:sz="4" w:space="0" w:color="000000"/>
+              <w:bottom w:val="single" w:sz="4" w:space="0" w:color="E3E3E3"/>
+              <w:right w:val="nil"/>
             </w:tcBorders>
             <w:shd w:val="clear" w:color="000000" w:fill="F2F2F2"/>
             <w:noWrap/>
@@ -7407,10 +7414,10 @@
             <w:tcW w:w="630" w:type="pct"/>
             <w:vMerge w:val="restart"/>
             <w:tcBorders>
-              <w:top w:val="single" w:sz="4" w:space="0" w:color="auto"/>
-              <w:left w:val="single" w:sz="4" w:space="0" w:color="auto"/>
-              <w:bottom w:val="single" w:sz="4" w:space="0" w:color="000000"/>
-              <w:right w:val="single" w:sz="4" w:space="0" w:color="auto"/>
+              <w:top w:val="single" w:sz="4" w:space="0" w:color="E3E3E3"/>
+              <w:left w:val="nil"/>
+              <w:bottom w:val="single" w:sz="4" w:space="0" w:color="E3E3E3"/>
+              <w:right w:val="nil"/>
             </w:tcBorders>
             <w:shd w:val="clear" w:color="000000" w:fill="F2F2F2"/>
             <w:vAlign w:val="center"/>
@@ -7452,10 +7459,10 @@
             <w:tcW w:w="1037" w:type="pct"/>
             <w:vMerge/>
             <w:tcBorders>
-              <w:top w:val="single" w:sz="4" w:space="0" w:color="auto"/>
-              <w:left w:val="single" w:sz="4" w:space="0" w:color="auto"/>
-              <w:bottom w:val="single" w:sz="4" w:space="0" w:color="auto"/>
-              <w:right w:val="single" w:sz="4" w:space="0" w:color="auto"/>
+              <w:top w:val="single" w:sz="4" w:space="0" w:color="E3E3E3"/>
+              <w:left w:val="nil"/>
+              <w:bottom w:val="single" w:sz="4" w:space="0" w:color="E3E3E3"/>
+              <w:right w:val="nil"/>
             </w:tcBorders>
             <w:vAlign w:val="center"/>
             <w:hideMark/>
@@ -7480,10 +7487,10 @@
             <w:tcW w:w="851" w:type="pct"/>
             <w:gridSpan w:val="2"/>
             <w:tcBorders>
-              <w:top w:val="single" w:sz="4" w:space="0" w:color="auto"/>
+              <w:top w:val="single" w:sz="4" w:space="0" w:color="E3E3E3"/>
               <w:left w:val="nil"/>
-              <w:bottom w:val="single" w:sz="4" w:space="0" w:color="auto"/>
-              <w:right w:val="single" w:sz="4" w:space="0" w:color="000000"/>
+              <w:bottom w:val="single" w:sz="4" w:space="0" w:color="E3E3E3"/>
+              <w:right w:val="nil"/>
             </w:tcBorders>
             <w:shd w:val="clear" w:color="000000" w:fill="F2F2F2"/>
             <w:noWrap/>
@@ -7521,10 +7528,10 @@
             <w:tcW w:w="849" w:type="pct"/>
             <w:gridSpan w:val="2"/>
             <w:tcBorders>
-              <w:top w:val="single" w:sz="4" w:space="0" w:color="auto"/>
+              <w:top w:val="single" w:sz="4" w:space="0" w:color="E3E3E3"/>
               <w:left w:val="nil"/>
-              <w:bottom w:val="single" w:sz="4" w:space="0" w:color="auto"/>
-              <w:right w:val="single" w:sz="4" w:space="0" w:color="000000"/>
+              <w:bottom w:val="single" w:sz="4" w:space="0" w:color="E3E3E3"/>
+              <w:right w:val="nil"/>
             </w:tcBorders>
             <w:shd w:val="clear" w:color="000000" w:fill="F2F2F2"/>
             <w:noWrap/>
@@ -7562,10 +7569,10 @@
             <w:tcW w:w="875" w:type="pct"/>
             <w:gridSpan w:val="2"/>
             <w:tcBorders>
-              <w:top w:val="single" w:sz="4" w:space="0" w:color="auto"/>
+              <w:top w:val="single" w:sz="4" w:space="0" w:color="E3E3E3"/>
               <w:left w:val="nil"/>
-              <w:bottom w:val="single" w:sz="4" w:space="0" w:color="auto"/>
-              <w:right w:val="single" w:sz="4" w:space="0" w:color="000000"/>
+              <w:bottom w:val="single" w:sz="4" w:space="0" w:color="E3E3E3"/>
+              <w:right w:val="nil"/>
             </w:tcBorders>
             <w:shd w:val="clear" w:color="000000" w:fill="F2F2F2"/>
             <w:noWrap/>
@@ -7604,8 +7611,8 @@
             <w:tcBorders>
               <w:top w:val="nil"/>
               <w:left w:val="nil"/>
-              <w:bottom w:val="single" w:sz="4" w:space="0" w:color="auto"/>
-              <w:right w:val="single" w:sz="4" w:space="0" w:color="auto"/>
+              <w:bottom w:val="single" w:sz="4" w:space="0" w:color="E3E3E3"/>
+              <w:right w:val="nil"/>
             </w:tcBorders>
             <w:shd w:val="clear" w:color="000000" w:fill="F2F2F2"/>
             <w:noWrap/>
@@ -7643,10 +7650,10 @@
             <w:tcW w:w="630" w:type="pct"/>
             <w:vMerge/>
             <w:tcBorders>
-              <w:top w:val="single" w:sz="4" w:space="0" w:color="auto"/>
-              <w:left w:val="single" w:sz="4" w:space="0" w:color="auto"/>
-              <w:bottom w:val="single" w:sz="4" w:space="0" w:color="000000"/>
-              <w:right w:val="single" w:sz="4" w:space="0" w:color="auto"/>
+              <w:top w:val="single" w:sz="4" w:space="0" w:color="E3E3E3"/>
+              <w:left w:val="nil"/>
+              <w:bottom w:val="single" w:sz="4" w:space="0" w:color="E3E3E3"/>
+              <w:right w:val="nil"/>
             </w:tcBorders>
             <w:vAlign w:val="center"/>
             <w:hideMark/>
@@ -7676,10 +7683,10 @@
             <w:tcW w:w="1037" w:type="pct"/>
             <w:vMerge/>
             <w:tcBorders>
-              <w:top w:val="single" w:sz="4" w:space="0" w:color="auto"/>
-              <w:left w:val="single" w:sz="4" w:space="0" w:color="auto"/>
-              <w:bottom w:val="single" w:sz="4" w:space="0" w:color="auto"/>
-              <w:right w:val="single" w:sz="4" w:space="0" w:color="auto"/>
+              <w:top w:val="single" w:sz="4" w:space="0" w:color="E3E3E3"/>
+              <w:left w:val="nil"/>
+              <w:bottom w:val="single" w:sz="4" w:space="0" w:color="E3E3E3"/>
+              <w:right w:val="nil"/>
             </w:tcBorders>
             <w:vAlign w:val="center"/>
             <w:hideMark/>
@@ -7705,8 +7712,8 @@
             <w:tcBorders>
               <w:top w:val="nil"/>
               <w:left w:val="nil"/>
-              <w:bottom w:val="single" w:sz="4" w:space="0" w:color="auto"/>
-              <w:right w:val="single" w:sz="4" w:space="0" w:color="auto"/>
+              <w:bottom w:val="single" w:sz="4" w:space="0" w:color="E3E3E3"/>
+              <w:right w:val="nil"/>
             </w:tcBorders>
             <w:shd w:val="clear" w:color="000000" w:fill="F2F2F2"/>
             <w:noWrap/>
@@ -7745,8 +7752,8 @@
             <w:tcBorders>
               <w:top w:val="nil"/>
               <w:left w:val="nil"/>
-              <w:bottom w:val="single" w:sz="4" w:space="0" w:color="auto"/>
-              <w:right w:val="single" w:sz="4" w:space="0" w:color="auto"/>
+              <w:bottom w:val="single" w:sz="4" w:space="0" w:color="E3E3E3"/>
+              <w:right w:val="nil"/>
             </w:tcBorders>
             <w:shd w:val="clear" w:color="000000" w:fill="F2F2F2"/>
             <w:noWrap/>
@@ -7785,8 +7792,8 @@
             <w:tcBorders>
               <w:top w:val="nil"/>
               <w:left w:val="nil"/>
-              <w:bottom w:val="single" w:sz="4" w:space="0" w:color="auto"/>
-              <w:right w:val="single" w:sz="4" w:space="0" w:color="auto"/>
+              <w:bottom w:val="single" w:sz="4" w:space="0" w:color="E3E3E3"/>
+              <w:right w:val="nil"/>
             </w:tcBorders>
             <w:shd w:val="clear" w:color="000000" w:fill="F2F2F2"/>
             <w:noWrap/>
@@ -7825,8 +7832,8 @@
             <w:tcBorders>
               <w:top w:val="nil"/>
               <w:left w:val="nil"/>
-              <w:bottom w:val="single" w:sz="4" w:space="0" w:color="auto"/>
-              <w:right w:val="single" w:sz="4" w:space="0" w:color="auto"/>
+              <w:bottom w:val="single" w:sz="4" w:space="0" w:color="E3E3E3"/>
+              <w:right w:val="nil"/>
             </w:tcBorders>
             <w:shd w:val="clear" w:color="000000" w:fill="F2F2F2"/>
             <w:noWrap/>
@@ -7865,8 +7872,8 @@
             <w:tcBorders>
               <w:top w:val="nil"/>
               <w:left w:val="nil"/>
-              <w:bottom w:val="single" w:sz="4" w:space="0" w:color="auto"/>
-              <w:right w:val="single" w:sz="4" w:space="0" w:color="auto"/>
+              <w:bottom w:val="single" w:sz="4" w:space="0" w:color="E3E3E3"/>
+              <w:right w:val="nil"/>
             </w:tcBorders>
             <w:shd w:val="clear" w:color="000000" w:fill="F2F2F2"/>
             <w:noWrap/>
@@ -7905,8 +7912,8 @@
             <w:tcBorders>
               <w:top w:val="nil"/>
               <w:left w:val="nil"/>
-              <w:bottom w:val="single" w:sz="4" w:space="0" w:color="auto"/>
-              <w:right w:val="single" w:sz="4" w:space="0" w:color="auto"/>
+              <w:bottom w:val="single" w:sz="4" w:space="0" w:color="E3E3E3"/>
+              <w:right w:val="nil"/>
             </w:tcBorders>
             <w:shd w:val="clear" w:color="000000" w:fill="F2F2F2"/>
             <w:noWrap/>
@@ -7945,8 +7952,8 @@
             <w:tcBorders>
               <w:top w:val="nil"/>
               <w:left w:val="nil"/>
-              <w:bottom w:val="single" w:sz="4" w:space="0" w:color="auto"/>
-              <w:right w:val="single" w:sz="4" w:space="0" w:color="auto"/>
+              <w:bottom w:val="single" w:sz="4" w:space="0" w:color="E3E3E3"/>
+              <w:right w:val="nil"/>
             </w:tcBorders>
             <w:shd w:val="clear" w:color="000000" w:fill="F2F2F2"/>
             <w:noWrap/>
@@ -7985,8 +7992,8 @@
             <w:tcBorders>
               <w:top w:val="nil"/>
               <w:left w:val="nil"/>
-              <w:bottom w:val="single" w:sz="4" w:space="0" w:color="auto"/>
-              <w:right w:val="single" w:sz="4" w:space="0" w:color="auto"/>
+              <w:bottom w:val="single" w:sz="4" w:space="0" w:color="E3E3E3"/>
+              <w:right w:val="nil"/>
             </w:tcBorders>
             <w:shd w:val="clear" w:color="000000" w:fill="F2F2F2"/>
             <w:noWrap/>
@@ -8028,10 +8035,10 @@
           <w:tcPr>
             <w:tcW w:w="1037" w:type="pct"/>
             <w:tcBorders>
-              <w:top w:val="single" w:sz="4" w:space="0" w:color="auto"/>
-              <w:left w:val="single" w:sz="4" w:space="0" w:color="auto"/>
-              <w:bottom w:val="single" w:sz="4" w:space="0" w:color="auto"/>
-              <w:right w:val="single" w:sz="4" w:space="0" w:color="auto"/>
+              <w:top w:val="single" w:sz="4" w:space="0" w:color="E3E3E3"/>
+              <w:left w:val="nil"/>
+              <w:bottom w:val="single" w:sz="4" w:space="0" w:color="E3E3E3"/>
+              <w:right w:val="nil"/>
             </w:tcBorders>
             <w:noWrap/>
             <w:vAlign w:val="center"/>
@@ -8063,10 +8070,10 @@
           <w:tcPr>
             <w:tcW w:w="518" w:type="pct"/>
             <w:tcBorders>
-              <w:top w:val="single" w:sz="4" w:space="0" w:color="auto"/>
+              <w:top w:val="single" w:sz="4" w:space="0" w:color="E3E3E3"/>
               <w:left w:val="nil"/>
-              <w:bottom w:val="single" w:sz="4" w:space="0" w:color="auto"/>
-              <w:right w:val="single" w:sz="4" w:space="0" w:color="auto"/>
+              <w:bottom w:val="single" w:sz="4" w:space="0" w:color="E3E3E3"/>
+              <w:right w:val="nil"/>
             </w:tcBorders>
             <w:noWrap/>
             <w:vAlign w:val="center"/>
@@ -8088,10 +8095,10 @@
           <w:tcPr>
             <w:tcW w:w="333" w:type="pct"/>
             <w:tcBorders>
-              <w:top w:val="single" w:sz="4" w:space="0" w:color="auto"/>
+              <w:top w:val="single" w:sz="4" w:space="0" w:color="E3E3E3"/>
               <w:left w:val="nil"/>
-              <w:bottom w:val="single" w:sz="4" w:space="0" w:color="auto"/>
-              <w:right w:val="single" w:sz="4" w:space="0" w:color="auto"/>
+              <w:bottom w:val="single" w:sz="4" w:space="0" w:color="E3E3E3"/>
+              <w:right w:val="nil"/>
             </w:tcBorders>
             <w:noWrap/>
             <w:vAlign w:val="center"/>
@@ -8113,10 +8120,10 @@
           <w:tcPr>
             <w:tcW w:w="516" w:type="pct"/>
             <w:tcBorders>
-              <w:top w:val="single" w:sz="4" w:space="0" w:color="auto"/>
+              <w:top w:val="single" w:sz="4" w:space="0" w:color="E3E3E3"/>
               <w:left w:val="nil"/>
-              <w:bottom w:val="single" w:sz="4" w:space="0" w:color="auto"/>
-              <w:right w:val="single" w:sz="4" w:space="0" w:color="auto"/>
+              <w:bottom w:val="single" w:sz="4" w:space="0" w:color="E3E3E3"/>
+              <w:right w:val="nil"/>
             </w:tcBorders>
             <w:noWrap/>
             <w:vAlign w:val="center"/>
@@ -8138,10 +8145,10 @@
           <w:tcPr>
             <w:tcW w:w="333" w:type="pct"/>
             <w:tcBorders>
-              <w:top w:val="single" w:sz="4" w:space="0" w:color="auto"/>
+              <w:top w:val="single" w:sz="4" w:space="0" w:color="E3E3E3"/>
               <w:left w:val="nil"/>
-              <w:bottom w:val="single" w:sz="4" w:space="0" w:color="auto"/>
-              <w:right w:val="single" w:sz="4" w:space="0" w:color="auto"/>
+              <w:bottom w:val="single" w:sz="4" w:space="0" w:color="E3E3E3"/>
+              <w:right w:val="nil"/>
             </w:tcBorders>
             <w:noWrap/>
             <w:vAlign w:val="center"/>
@@ -8163,10 +8170,10 @@
           <w:tcPr>
             <w:tcW w:w="538" w:type="pct"/>
             <w:tcBorders>
-              <w:top w:val="single" w:sz="4" w:space="0" w:color="auto"/>
+              <w:top w:val="single" w:sz="4" w:space="0" w:color="E3E3E3"/>
               <w:left w:val="nil"/>
-              <w:bottom w:val="single" w:sz="4" w:space="0" w:color="auto"/>
-              <w:right w:val="single" w:sz="4" w:space="0" w:color="auto"/>
+              <w:bottom w:val="single" w:sz="4" w:space="0" w:color="E3E3E3"/>
+              <w:right w:val="nil"/>
             </w:tcBorders>
             <w:noWrap/>
             <w:vAlign w:val="center"/>
@@ -8188,10 +8195,10 @@
           <w:tcPr>
             <w:tcW w:w="337" w:type="pct"/>
             <w:tcBorders>
-              <w:top w:val="single" w:sz="4" w:space="0" w:color="auto"/>
+              <w:top w:val="single" w:sz="4" w:space="0" w:color="E3E3E3"/>
               <w:left w:val="nil"/>
-              <w:bottom w:val="single" w:sz="4" w:space="0" w:color="auto"/>
-              <w:right w:val="single" w:sz="4" w:space="0" w:color="auto"/>
+              <w:bottom w:val="single" w:sz="4" w:space="0" w:color="E3E3E3"/>
+              <w:right w:val="nil"/>
             </w:tcBorders>
             <w:noWrap/>
             <w:vAlign w:val="center"/>
@@ -8213,10 +8220,10 @@
           <w:tcPr>
             <w:tcW w:w="758" w:type="pct"/>
             <w:tcBorders>
-              <w:top w:val="single" w:sz="4" w:space="0" w:color="auto"/>
+              <w:top w:val="single" w:sz="4" w:space="0" w:color="E3E3E3"/>
               <w:left w:val="nil"/>
-              <w:bottom w:val="single" w:sz="4" w:space="0" w:color="auto"/>
-              <w:right w:val="single" w:sz="4" w:space="0" w:color="auto"/>
+              <w:bottom w:val="single" w:sz="4" w:space="0" w:color="E3E3E3"/>
+              <w:right w:val="nil"/>
             </w:tcBorders>
             <w:noWrap/>
             <w:vAlign w:val="center"/>
@@ -8238,10 +8245,10 @@
           <w:tcPr>
             <w:tcW w:w="630" w:type="pct"/>
             <w:tcBorders>
-              <w:top w:val="single" w:sz="4" w:space="0" w:color="auto"/>
+              <w:top w:val="single" w:sz="4" w:space="0" w:color="E3E3E3"/>
               <w:left w:val="nil"/>
-              <w:bottom w:val="single" w:sz="4" w:space="0" w:color="auto"/>
-              <w:right w:val="single" w:sz="4" w:space="0" w:color="auto"/>
+              <w:bottom w:val="single" w:sz="4" w:space="0" w:color="E3E3E3"/>
+              <w:right w:val="nil"/>
             </w:tcBorders>
             <w:noWrap/>
             <w:vAlign w:val="center"/>
@@ -8268,10 +8275,10 @@
           <w:tcPr>
             <w:tcW w:w="1037" w:type="pct"/>
             <w:tcBorders>
-              <w:top w:val="single" w:sz="4" w:space="0" w:color="auto"/>
-              <w:left w:val="single" w:sz="4" w:space="0" w:color="auto"/>
-              <w:bottom w:val="single" w:sz="4" w:space="0" w:color="auto"/>
-              <w:right w:val="single" w:sz="4" w:space="0" w:color="auto"/>
+              <w:top w:val="single" w:sz="4" w:space="0" w:color="E3E3E3"/>
+              <w:left w:val="nil"/>
+              <w:bottom w:val="single" w:sz="4" w:space="0" w:color="E3E3E3"/>
+              <w:right w:val="nil"/>
             </w:tcBorders>
             <w:noWrap/>
             <w:vAlign w:val="center"/>
@@ -8302,10 +8309,10 @@
           <w:tcPr>
             <w:tcW w:w="518" w:type="pct"/>
             <w:tcBorders>
-              <w:top w:val="single" w:sz="4" w:space="0" w:color="auto"/>
+              <w:top w:val="single" w:sz="4" w:space="0" w:color="E3E3E3"/>
               <w:left w:val="nil"/>
-              <w:bottom w:val="single" w:sz="4" w:space="0" w:color="auto"/>
-              <w:right w:val="single" w:sz="4" w:space="0" w:color="auto"/>
+              <w:bottom w:val="single" w:sz="4" w:space="0" w:color="E3E3E3"/>
+              <w:right w:val="nil"/>
             </w:tcBorders>
             <w:noWrap/>
             <w:vAlign w:val="center"/>
@@ -8327,10 +8334,10 @@
           <w:tcPr>
             <w:tcW w:w="333" w:type="pct"/>
             <w:tcBorders>
-              <w:top w:val="single" w:sz="4" w:space="0" w:color="auto"/>
+              <w:top w:val="single" w:sz="4" w:space="0" w:color="E3E3E3"/>
               <w:left w:val="nil"/>
-              <w:bottom w:val="single" w:sz="4" w:space="0" w:color="auto"/>
-              <w:right w:val="single" w:sz="4" w:space="0" w:color="auto"/>
+              <w:bottom w:val="single" w:sz="4" w:space="0" w:color="E3E3E3"/>
+              <w:right w:val="nil"/>
             </w:tcBorders>
             <w:noWrap/>
             <w:vAlign w:val="center"/>
@@ -8352,10 +8359,10 @@
           <w:tcPr>
             <w:tcW w:w="516" w:type="pct"/>
             <w:tcBorders>
-              <w:top w:val="single" w:sz="4" w:space="0" w:color="auto"/>
+              <w:top w:val="single" w:sz="4" w:space="0" w:color="E3E3E3"/>
               <w:left w:val="nil"/>
-              <w:bottom w:val="single" w:sz="4" w:space="0" w:color="auto"/>
-              <w:right w:val="single" w:sz="4" w:space="0" w:color="auto"/>
+              <w:bottom w:val="single" w:sz="4" w:space="0" w:color="E3E3E3"/>
+              <w:right w:val="nil"/>
             </w:tcBorders>
             <w:noWrap/>
             <w:vAlign w:val="center"/>
@@ -8377,10 +8384,10 @@
           <w:tcPr>
             <w:tcW w:w="333" w:type="pct"/>
             <w:tcBorders>
-              <w:top w:val="single" w:sz="4" w:space="0" w:color="auto"/>
+              <w:top w:val="single" w:sz="4" w:space="0" w:color="E3E3E3"/>
               <w:left w:val="nil"/>
-              <w:bottom w:val="single" w:sz="4" w:space="0" w:color="auto"/>
-              <w:right w:val="single" w:sz="4" w:space="0" w:color="auto"/>
+              <w:bottom w:val="single" w:sz="4" w:space="0" w:color="E3E3E3"/>
+              <w:right w:val="nil"/>
             </w:tcBorders>
             <w:noWrap/>
             <w:vAlign w:val="center"/>
@@ -8402,10 +8409,10 @@
           <w:tcPr>
             <w:tcW w:w="538" w:type="pct"/>
             <w:tcBorders>
-              <w:top w:val="single" w:sz="4" w:space="0" w:color="auto"/>
+              <w:top w:val="single" w:sz="4" w:space="0" w:color="E3E3E3"/>
               <w:left w:val="nil"/>
-              <w:bottom w:val="single" w:sz="4" w:space="0" w:color="auto"/>
-              <w:right w:val="single" w:sz="4" w:space="0" w:color="auto"/>
+              <w:bottom w:val="single" w:sz="4" w:space="0" w:color="E3E3E3"/>
+              <w:right w:val="nil"/>
             </w:tcBorders>
             <w:noWrap/>
             <w:vAlign w:val="center"/>
@@ -8427,10 +8434,10 @@
           <w:tcPr>
             <w:tcW w:w="337" w:type="pct"/>
             <w:tcBorders>
-              <w:top w:val="single" w:sz="4" w:space="0" w:color="auto"/>
+              <w:top w:val="single" w:sz="4" w:space="0" w:color="E3E3E3"/>
               <w:left w:val="nil"/>
-              <w:bottom w:val="single" w:sz="4" w:space="0" w:color="auto"/>
-              <w:right w:val="single" w:sz="4" w:space="0" w:color="auto"/>
+              <w:bottom w:val="single" w:sz="4" w:space="0" w:color="E3E3E3"/>
+              <w:right w:val="nil"/>
             </w:tcBorders>
             <w:noWrap/>
             <w:vAlign w:val="center"/>
@@ -8452,10 +8459,10 @@
           <w:tcPr>
             <w:tcW w:w="758" w:type="pct"/>
             <w:tcBorders>
-              <w:top w:val="single" w:sz="4" w:space="0" w:color="auto"/>
+              <w:top w:val="single" w:sz="4" w:space="0" w:color="E3E3E3"/>
               <w:left w:val="nil"/>
-              <w:bottom w:val="single" w:sz="4" w:space="0" w:color="auto"/>
-              <w:right w:val="single" w:sz="4" w:space="0" w:color="auto"/>
+              <w:bottom w:val="single" w:sz="4" w:space="0" w:color="E3E3E3"/>
+              <w:right w:val="nil"/>
             </w:tcBorders>
             <w:noWrap/>
             <w:vAlign w:val="center"/>
@@ -8477,10 +8484,10 @@
           <w:tcPr>
             <w:tcW w:w="630" w:type="pct"/>
             <w:tcBorders>
-              <w:top w:val="single" w:sz="4" w:space="0" w:color="auto"/>
+              <w:top w:val="single" w:sz="4" w:space="0" w:color="E3E3E3"/>
               <w:left w:val="nil"/>
-              <w:bottom w:val="single" w:sz="4" w:space="0" w:color="auto"/>
-              <w:right w:val="single" w:sz="4" w:space="0" w:color="auto"/>
+              <w:bottom w:val="single" w:sz="4" w:space="0" w:color="E3E3E3"/>
+              <w:right w:val="nil"/>
             </w:tcBorders>
             <w:noWrap/>
             <w:vAlign w:val="center"/>
@@ -8507,10 +8514,10 @@
           <w:tcPr>
             <w:tcW w:w="1037" w:type="pct"/>
             <w:tcBorders>
-              <w:top w:val="single" w:sz="4" w:space="0" w:color="auto"/>
-              <w:left w:val="single" w:sz="4" w:space="0" w:color="auto"/>
-              <w:bottom w:val="single" w:sz="4" w:space="0" w:color="auto"/>
-              <w:right w:val="single" w:sz="4" w:space="0" w:color="auto"/>
+              <w:top w:val="single" w:sz="4" w:space="0" w:color="E3E3E3"/>
+              <w:left w:val="nil"/>
+              <w:bottom w:val="single" w:sz="4" w:space="0" w:color="E3E3E3"/>
+              <w:right w:val="nil"/>
             </w:tcBorders>
             <w:noWrap/>
             <w:vAlign w:val="center"/>
@@ -8541,10 +8548,10 @@
           <w:tcPr>
             <w:tcW w:w="518" w:type="pct"/>
             <w:tcBorders>
-              <w:top w:val="single" w:sz="4" w:space="0" w:color="auto"/>
+              <w:top w:val="single" w:sz="4" w:space="0" w:color="E3E3E3"/>
               <w:left w:val="nil"/>
-              <w:bottom w:val="single" w:sz="4" w:space="0" w:color="auto"/>
-              <w:right w:val="single" w:sz="4" w:space="0" w:color="auto"/>
+              <w:bottom w:val="single" w:sz="4" w:space="0" w:color="E3E3E3"/>
+              <w:right w:val="nil"/>
             </w:tcBorders>
             <w:noWrap/>
             <w:vAlign w:val="center"/>
@@ -8566,10 +8573,10 @@
           <w:tcPr>
             <w:tcW w:w="333" w:type="pct"/>
             <w:tcBorders>
-              <w:top w:val="single" w:sz="4" w:space="0" w:color="auto"/>
+              <w:top w:val="single" w:sz="4" w:space="0" w:color="E3E3E3"/>
               <w:left w:val="nil"/>
-              <w:bottom w:val="single" w:sz="4" w:space="0" w:color="auto"/>
-              <w:right w:val="single" w:sz="4" w:space="0" w:color="auto"/>
+              <w:bottom w:val="single" w:sz="4" w:space="0" w:color="E3E3E3"/>
+              <w:right w:val="nil"/>
             </w:tcBorders>
             <w:noWrap/>
             <w:vAlign w:val="center"/>
@@ -8591,10 +8598,10 @@
           <w:tcPr>
             <w:tcW w:w="516" w:type="pct"/>
             <w:tcBorders>
-              <w:top w:val="single" w:sz="4" w:space="0" w:color="auto"/>
+              <w:top w:val="single" w:sz="4" w:space="0" w:color="E3E3E3"/>
               <w:left w:val="nil"/>
-              <w:bottom w:val="single" w:sz="4" w:space="0" w:color="auto"/>
-              <w:right w:val="single" w:sz="4" w:space="0" w:color="auto"/>
+              <w:bottom w:val="single" w:sz="4" w:space="0" w:color="E3E3E3"/>
+              <w:right w:val="nil"/>
             </w:tcBorders>
             <w:noWrap/>
             <w:vAlign w:val="center"/>
@@ -8616,10 +8623,10 @@
           <w:tcPr>
             <w:tcW w:w="333" w:type="pct"/>
             <w:tcBorders>
-              <w:top w:val="single" w:sz="4" w:space="0" w:color="auto"/>
+              <w:top w:val="single" w:sz="4" w:space="0" w:color="E3E3E3"/>
               <w:left w:val="nil"/>
-              <w:bottom w:val="single" w:sz="4" w:space="0" w:color="auto"/>
-              <w:right w:val="single" w:sz="4" w:space="0" w:color="auto"/>
+              <w:bottom w:val="single" w:sz="4" w:space="0" w:color="E3E3E3"/>
+              <w:right w:val="nil"/>
             </w:tcBorders>
             <w:noWrap/>
             <w:vAlign w:val="center"/>
@@ -8641,10 +8648,10 @@
           <w:tcPr>
             <w:tcW w:w="538" w:type="pct"/>
             <w:tcBorders>
-              <w:top w:val="single" w:sz="4" w:space="0" w:color="auto"/>
+              <w:top w:val="single" w:sz="4" w:space="0" w:color="E3E3E3"/>
               <w:left w:val="nil"/>
-              <w:bottom w:val="single" w:sz="4" w:space="0" w:color="auto"/>
-              <w:right w:val="single" w:sz="4" w:space="0" w:color="auto"/>
+              <w:bottom w:val="single" w:sz="4" w:space="0" w:color="E3E3E3"/>
+              <w:right w:val="nil"/>
             </w:tcBorders>
             <w:noWrap/>
             <w:vAlign w:val="center"/>
@@ -8666,10 +8673,10 @@
           <w:tcPr>
             <w:tcW w:w="337" w:type="pct"/>
             <w:tcBorders>
-              <w:top w:val="single" w:sz="4" w:space="0" w:color="auto"/>
+              <w:top w:val="single" w:sz="4" w:space="0" w:color="E3E3E3"/>
               <w:left w:val="nil"/>
-              <w:bottom w:val="single" w:sz="4" w:space="0" w:color="auto"/>
-              <w:right w:val="single" w:sz="4" w:space="0" w:color="auto"/>
+              <w:bottom w:val="single" w:sz="4" w:space="0" w:color="E3E3E3"/>
+              <w:right w:val="nil"/>
             </w:tcBorders>
             <w:noWrap/>
             <w:vAlign w:val="center"/>
@@ -8691,10 +8698,10 @@
           <w:tcPr>
             <w:tcW w:w="758" w:type="pct"/>
             <w:tcBorders>
-              <w:top w:val="single" w:sz="4" w:space="0" w:color="auto"/>
+              <w:top w:val="single" w:sz="4" w:space="0" w:color="E3E3E3"/>
               <w:left w:val="nil"/>
-              <w:bottom w:val="single" w:sz="4" w:space="0" w:color="auto"/>
-              <w:right w:val="single" w:sz="4" w:space="0" w:color="auto"/>
+              <w:bottom w:val="single" w:sz="4" w:space="0" w:color="E3E3E3"/>
+              <w:right w:val="nil"/>
             </w:tcBorders>
             <w:noWrap/>
             <w:vAlign w:val="center"/>
@@ -8716,10 +8723,10 @@
           <w:tcPr>
             <w:tcW w:w="630" w:type="pct"/>
             <w:tcBorders>
-              <w:top w:val="single" w:sz="4" w:space="0" w:color="auto"/>
+              <w:top w:val="single" w:sz="4" w:space="0" w:color="E3E3E3"/>
               <w:left w:val="nil"/>
-              <w:bottom w:val="single" w:sz="4" w:space="0" w:color="auto"/>
-              <w:right w:val="single" w:sz="4" w:space="0" w:color="auto"/>
+              <w:bottom w:val="single" w:sz="4" w:space="0" w:color="E3E3E3"/>
+              <w:right w:val="nil"/>
             </w:tcBorders>
             <w:noWrap/>
             <w:vAlign w:val="center"/>
@@ -10265,10 +10272,10 @@
           <w:tcPr>
             <w:tcW w:w="1520" w:type="pct"/>
             <w:tcBorders>
-              <w:top w:val="single" w:sz="4" w:space="0" w:color="auto"/>
-              <w:left w:val="single" w:sz="4" w:space="0" w:color="auto"/>
-              <w:bottom w:val="single" w:sz="4" w:space="0" w:color="auto"/>
-              <w:right w:val="single" w:sz="4" w:space="0" w:color="auto"/>
+              <w:top w:val="single" w:sz="4" w:space="0" w:color="E3E3E3"/>
+              <w:left w:val="nil"/>
+              <w:bottom w:val="single" w:sz="4" w:space="0" w:color="E3E3E3"/>
+              <w:right w:val="nil"/>
             </w:tcBorders>
             <w:shd w:val="clear" w:color="auto" w:fill="E7E6E6" w:themeFill="background2"/>
             <w:noWrap/>
@@ -10316,10 +10323,10 @@
           <w:tcPr>
             <w:tcW w:w="3480" w:type="pct"/>
             <w:tcBorders>
-              <w:top w:val="single" w:sz="4" w:space="0" w:color="auto"/>
+              <w:top w:val="single" w:sz="4" w:space="0" w:color="E3E3E3"/>
               <w:left w:val="nil"/>
-              <w:bottom w:val="single" w:sz="4" w:space="0" w:color="auto"/>
-              <w:right w:val="single" w:sz="4" w:space="0" w:color="auto"/>
+              <w:bottom w:val="single" w:sz="4" w:space="0" w:color="E3E3E3"/>
+              <w:right w:val="nil"/>
             </w:tcBorders>
             <w:noWrap/>
             <w:vAlign w:val="center"/>
@@ -10356,10 +10363,10 @@
           <w:tcPr>
             <w:tcW w:w="1520" w:type="pct"/>
             <w:tcBorders>
-              <w:top w:val="single" w:sz="4" w:space="0" w:color="auto"/>
-              <w:left w:val="single" w:sz="4" w:space="0" w:color="auto"/>
-              <w:bottom w:val="single" w:sz="4" w:space="0" w:color="auto"/>
-              <w:right w:val="single" w:sz="4" w:space="0" w:color="auto"/>
+              <w:top w:val="single" w:sz="4" w:space="0" w:color="E3E3E3"/>
+              <w:left w:val="nil"/>
+              <w:bottom w:val="single" w:sz="4" w:space="0" w:color="E3E3E3"/>
+              <w:right w:val="nil"/>
             </w:tcBorders>
             <w:shd w:val="clear" w:color="000000" w:fill="F2F2F2"/>
             <w:noWrap/>
@@ -10396,10 +10403,10 @@
           <w:tcPr>
             <w:tcW w:w="3480" w:type="pct"/>
             <w:tcBorders>
-              <w:top w:val="single" w:sz="4" w:space="0" w:color="auto"/>
+              <w:top w:val="single" w:sz="4" w:space="0" w:color="E3E3E3"/>
               <w:left w:val="nil"/>
-              <w:bottom w:val="single" w:sz="4" w:space="0" w:color="auto"/>
-              <w:right w:val="single" w:sz="4" w:space="0" w:color="auto"/>
+              <w:bottom w:val="single" w:sz="4" w:space="0" w:color="E3E3E3"/>
+              <w:right w:val="nil"/>
             </w:tcBorders>
             <w:vAlign w:val="center"/>
             <w:hideMark/>
@@ -10587,10 +10594,10 @@
           <w:tcPr>
             <w:tcW w:w="1377" w:type="pct"/>
             <w:tcBorders>
-              <w:top w:val="single" w:sz="4" w:space="0" w:color="auto"/>
-              <w:left w:val="single" w:sz="4" w:space="0" w:color="auto"/>
-              <w:bottom w:val="single" w:sz="4" w:space="0" w:color="auto"/>
-              <w:right w:val="single" w:sz="4" w:space="0" w:color="000000"/>
+              <w:top w:val="single" w:sz="4" w:space="0" w:color="E3E3E3"/>
+              <w:left w:val="nil"/>
+              <w:bottom w:val="single" w:sz="4" w:space="0" w:color="E3E3E3"/>
+              <w:right w:val="nil"/>
             </w:tcBorders>
             <w:shd w:val="clear" w:color="000000" w:fill="F2F2F2"/>
             <w:noWrap/>
@@ -10627,10 +10634,10 @@
           <w:tcPr>
             <w:tcW w:w="1337" w:type="pct"/>
             <w:tcBorders>
-              <w:top w:val="single" w:sz="4" w:space="0" w:color="auto"/>
+              <w:top w:val="single" w:sz="4" w:space="0" w:color="E3E3E3"/>
               <w:left w:val="nil"/>
-              <w:bottom w:val="single" w:sz="4" w:space="0" w:color="auto"/>
-              <w:right w:val="single" w:sz="4" w:space="0" w:color="000000"/>
+              <w:bottom w:val="single" w:sz="4" w:space="0" w:color="E3E3E3"/>
+              <w:right w:val="nil"/>
             </w:tcBorders>
             <w:shd w:val="clear" w:color="000000" w:fill="F2F2F2"/>
             <w:noWrap/>
@@ -10667,10 +10674,10 @@
           <w:tcPr>
             <w:tcW w:w="818" w:type="pct"/>
             <w:tcBorders>
-              <w:top w:val="single" w:sz="4" w:space="0" w:color="auto"/>
+              <w:top w:val="single" w:sz="4" w:space="0" w:color="E3E3E3"/>
               <w:left w:val="nil"/>
-              <w:bottom w:val="single" w:sz="4" w:space="0" w:color="auto"/>
-              <w:right w:val="single" w:sz="4" w:space="0" w:color="auto"/>
+              <w:bottom w:val="single" w:sz="4" w:space="0" w:color="E3E3E3"/>
+              <w:right w:val="nil"/>
             </w:tcBorders>
             <w:shd w:val="clear" w:color="000000" w:fill="F2F2F2"/>
             <w:noWrap/>
@@ -10707,10 +10714,10 @@
           <w:tcPr>
             <w:tcW w:w="1468" w:type="pct"/>
             <w:tcBorders>
-              <w:top w:val="single" w:sz="4" w:space="0" w:color="auto"/>
+              <w:top w:val="single" w:sz="4" w:space="0" w:color="E3E3E3"/>
               <w:left w:val="nil"/>
-              <w:bottom w:val="single" w:sz="4" w:space="0" w:color="auto"/>
-              <w:right w:val="single" w:sz="4" w:space="0" w:color="auto"/>
+              <w:bottom w:val="single" w:sz="4" w:space="0" w:color="E3E3E3"/>
+              <w:right w:val="nil"/>
             </w:tcBorders>
             <w:shd w:val="clear" w:color="000000" w:fill="F2F2F2"/>
             <w:noWrap/>
@@ -10752,10 +10759,10 @@
           <w:tcPr>
             <w:tcW w:w="1377" w:type="pct"/>
             <w:tcBorders>
-              <w:top w:val="single" w:sz="4" w:space="0" w:color="auto"/>
-              <w:left w:val="single" w:sz="4" w:space="0" w:color="auto"/>
-              <w:bottom w:val="single" w:sz="4" w:space="0" w:color="auto"/>
-              <w:right w:val="single" w:sz="4" w:space="0" w:color="000000"/>
+              <w:top w:val="single" w:sz="4" w:space="0" w:color="E3E3E3"/>
+              <w:left w:val="nil"/>
+              <w:bottom w:val="single" w:sz="4" w:space="0" w:color="E3E3E3"/>
+              <w:right w:val="nil"/>
             </w:tcBorders>
             <w:noWrap/>
             <w:vAlign w:val="center"/>
@@ -10796,10 +10803,10 @@
           <w:tcPr>
             <w:tcW w:w="1337" w:type="pct"/>
             <w:tcBorders>
-              <w:top w:val="single" w:sz="4" w:space="0" w:color="auto"/>
+              <w:top w:val="single" w:sz="4" w:space="0" w:color="E3E3E3"/>
               <w:left w:val="nil"/>
-              <w:bottom w:val="single" w:sz="4" w:space="0" w:color="auto"/>
-              <w:right w:val="single" w:sz="4" w:space="0" w:color="000000"/>
+              <w:bottom w:val="single" w:sz="4" w:space="0" w:color="E3E3E3"/>
+              <w:right w:val="nil"/>
             </w:tcBorders>
             <w:noWrap/>
             <w:vAlign w:val="center"/>
@@ -10833,8 +10840,8 @@
             <w:tcBorders>
               <w:top w:val="nil"/>
               <w:left w:val="nil"/>
-              <w:bottom w:val="single" w:sz="4" w:space="0" w:color="auto"/>
-              <w:right w:val="single" w:sz="4" w:space="0" w:color="auto"/>
+              <w:bottom w:val="single" w:sz="4" w:space="0" w:color="E3E3E3"/>
+              <w:right w:val="nil"/>
             </w:tcBorders>
             <w:noWrap/>
             <w:vAlign w:val="center"/>
@@ -10866,10 +10873,10 @@
           <w:tcPr>
             <w:tcW w:w="1468" w:type="pct"/>
             <w:tcBorders>
-              <w:top w:val="single" w:sz="4" w:space="0" w:color="auto"/>
+              <w:top w:val="single" w:sz="4" w:space="0" w:color="E3E3E3"/>
               <w:left w:val="nil"/>
-              <w:bottom w:val="single" w:sz="4" w:space="0" w:color="auto"/>
-              <w:right w:val="single" w:sz="4" w:space="0" w:color="auto"/>
+              <w:bottom w:val="single" w:sz="4" w:space="0" w:color="E3E3E3"/>
+              <w:right w:val="nil"/>
             </w:tcBorders>
             <w:noWrap/>
             <w:vAlign w:val="center"/>

</xml_diff>